<commit_message>
Manuales: módulo de nómina y generador que corre en Windows
- Manual de usuario 1.1: capítulo 15 Nómina y pagos de personal (registro, importación
  de Nomipac, validación y CLC por unidad, finiquitos y laudos), regla del capítulo 1000,
  roles Recursos Humanos y Control Presupuestal y preguntas frecuentes.
- Manual de producción 1.1: migración crear_nominas, roles, configuración de la nómina,
  .npmrc (legacy-peer-deps) y lista de verificación.
- Generador: 05_nomina.php con datos ficticios y 6 capturas nuevas; en Windows copia
  ORIGEN (sieg_angular), reduce imágenes con GD y sirve la demostración con Node y php-cgi.

Co-Authored-By: Claude Opus 5.5 <noreply@anthropic.com>
</commit_message>
<xml_diff>
--- a/docs/manuales/SIEG - Manual de producción.docx
+++ b/docs/manuales/SIEG - Manual de producción.docx
@@ -129,7 +129,7 @@
           <w:sz w:val="20"/>
           <w:szCs w:val="20"/>
         </w:rPr>
-        <w:t xml:space="preserve">Versión 1.0 · Octubre de 2026</w:t>
+        <w:t xml:space="preserve">Versión 1.1 · Octubre de 2026</w:t>
       </w:r>
     </w:p>
     <w:p>
@@ -792,7 +792,7 @@
                 <w:sz w:val="19"/>
                 <w:szCs w:val="19"/>
               </w:rPr>
-              <w:t xml:space="preserve">XML y PDF de facturas, expedientes del padrón, Excel del combustible e imágenes de tickets.</w:t>
+              <w:t xml:space="preserve">XML y PDF de facturas, expedientes del padrón, Excel del combustible y de la nómina, e imágenes de tickets.</w:t>
             </w:r>
           </w:p>
         </w:tc>
@@ -4357,7 +4357,7 @@
         <w:t xml:space="preserve">RolesSistemaSeeder</w:t>
       </w:r>
       <w:r>
-        <w:t xml:space="preserve"> crea los roles de los módulos nuevos (Área solicitante, Recursos Materiales, Control de combustible, Órgano Interno de Control, Tesorería, Contabilidad) y solo </w:t>
+        <w:t xml:space="preserve"> crea los roles de los módulos nuevos (Área solicitante, Recursos Materiales, Control de combustible, Órgano Interno de Control, Tesorería, Contabilidad, Recursos Humanos y Control Presupuestal) y solo </w:t>
       </w:r>
       <w:r>
         <w:rPr>
@@ -4385,6 +4385,143 @@
           <w:bCs/>
           <w:color w:val="7A1F3D"/>
         </w:rPr>
+        <w:t xml:space="preserve">Nota: </w:t>
+      </w:r>
+      <w:r>
+        <w:t xml:space="preserve">La migración </w:t>
+      </w:r>
+      <w:r>
+        <w:rPr>
+          <w:rFonts w:ascii="Consolas" w:cs="Consolas" w:eastAsia="Consolas" w:hAnsi="Consolas"/>
+          <w:color w:val="7A1F3D"/>
+          <w:sz w:val="19"/>
+          <w:szCs w:val="19"/>
+        </w:rPr>
+        <w:t xml:space="preserve">crear_nominas</w:t>
+      </w:r>
+      <w:r>
+        <w:t xml:space="preserve"> (módulo de nómina) agrega las tablas </w:t>
+      </w:r>
+      <w:r>
+        <w:rPr>
+          <w:rFonts w:ascii="Consolas" w:cs="Consolas" w:eastAsia="Consolas" w:hAnsi="Consolas"/>
+          <w:color w:val="7A1F3D"/>
+          <w:sz w:val="19"/>
+          <w:szCs w:val="19"/>
+        </w:rPr>
+        <w:t xml:space="preserve">nominas</w:t>
+      </w:r>
+      <w:r>
+        <w:t xml:space="preserve"> y </w:t>
+      </w:r>
+      <w:r>
+        <w:rPr>
+          <w:rFonts w:ascii="Consolas" w:cs="Consolas" w:eastAsia="Consolas" w:hAnsi="Consolas"/>
+          <w:color w:val="7A1F3D"/>
+          <w:sz w:val="19"/>
+          <w:szCs w:val="19"/>
+        </w:rPr>
+        <w:t xml:space="preserve">nomina_renglones</w:t>
+      </w:r>
+      <w:r>
+        <w:t xml:space="preserve">, la columna </w:t>
+      </w:r>
+      <w:r>
+        <w:rPr>
+          <w:rFonts w:ascii="Consolas" w:cs="Consolas" w:eastAsia="Consolas" w:hAnsi="Consolas"/>
+          <w:color w:val="7A1F3D"/>
+          <w:sz w:val="19"/>
+          <w:szCs w:val="19"/>
+        </w:rPr>
+        <w:t xml:space="preserve">ordenes_compra.nomina_id</w:t>
+      </w:r>
+      <w:r>
+        <w:t xml:space="preserve">, los permisos </w:t>
+      </w:r>
+      <w:r>
+        <w:rPr>
+          <w:rFonts w:ascii="Consolas" w:cs="Consolas" w:eastAsia="Consolas" w:hAnsi="Consolas"/>
+          <w:color w:val="7A1F3D"/>
+          <w:sz w:val="19"/>
+          <w:szCs w:val="19"/>
+        </w:rPr>
+        <w:t xml:space="preserve">nomina-index</w:t>
+      </w:r>
+      <w:r>
+        <w:t xml:space="preserve">, </w:t>
+      </w:r>
+      <w:r>
+        <w:rPr>
+          <w:rFonts w:ascii="Consolas" w:cs="Consolas" w:eastAsia="Consolas" w:hAnsi="Consolas"/>
+          <w:color w:val="7A1F3D"/>
+          <w:sz w:val="19"/>
+          <w:szCs w:val="19"/>
+        </w:rPr>
+        <w:t xml:space="preserve">nomina-create</w:t>
+      </w:r>
+      <w:r>
+        <w:t xml:space="preserve">, </w:t>
+      </w:r>
+      <w:r>
+        <w:rPr>
+          <w:rFonts w:ascii="Consolas" w:cs="Consolas" w:eastAsia="Consolas" w:hAnsi="Consolas"/>
+          <w:color w:val="7A1F3D"/>
+          <w:sz w:val="19"/>
+          <w:szCs w:val="19"/>
+        </w:rPr>
+        <w:t xml:space="preserve">nomina-validar</w:t>
+      </w:r>
+      <w:r>
+        <w:t xml:space="preserve"> y </w:t>
+      </w:r>
+      <w:r>
+        <w:rPr>
+          <w:rFonts w:ascii="Consolas" w:cs="Consolas" w:eastAsia="Consolas" w:hAnsi="Consolas"/>
+          <w:color w:val="7A1F3D"/>
+          <w:sz w:val="19"/>
+          <w:szCs w:val="19"/>
+        </w:rPr>
+        <w:t xml:space="preserve">presupuesto-capitulo-1000</w:t>
+      </w:r>
+      <w:r>
+        <w:t xml:space="preserve">, y el rol </w:t>
+      </w:r>
+      <w:r>
+        <w:rPr>
+          <w:b/>
+          <w:bCs/>
+        </w:rPr>
+        <w:t xml:space="preserve">Recursos Humanos</w:t>
+      </w:r>
+      <w:r>
+        <w:t xml:space="preserve">. No borra datos. Después de aplicarla, asigna el rol Recursos Humanos a su personal en </w:t>
+      </w:r>
+      <w:r>
+        <w:rPr>
+          <w:b/>
+          <w:bCs/>
+        </w:rPr>
+        <w:t xml:space="preserve">Administración → Usuarios</w:t>
+      </w:r>
+      <w:r>
+        <w:t xml:space="preserve">.</w:t>
+      </w:r>
+    </w:p>
+    <w:p>
+      <w:pPr>
+        <w:pBdr>
+          <w:left w:val="single" w:color="7A1F3D" w:sz="18" w:space="8"/>
+        </w:pBdr>
+        <w:shd w:fill="F6EDF0" w:color="auto" w:val="clear"/>
+        <w:spacing w:before="120" w:after="160"/>
+        <w:ind w:left="120" w:right="120"/>
+      </w:pPr>
+      <w:r>
+        <w:rPr>
+          <w:b/>
+          <w:bCs/>
+          <w:color w:val="7A1F3D"/>
+        </w:rPr>
         <w:t xml:space="preserve">Importante: </w:t>
       </w:r>
       <w:r>
@@ -4569,7 +4706,19 @@
         <w:t xml:space="preserve">storage/app/private</w:t>
       </w:r>
       <w:r>
-        <w:t xml:space="preserve">: XML y PDF de facturas (órdenes de compra y trámites), expedientes del padrón y Excel del combustible. </w:t>
+        <w:t xml:space="preserve">: XML y PDF de facturas (órdenes de compra y trámites), expedientes del padrón, Excel del combustible y Excel de la nómina importada (</w:t>
+      </w:r>
+      <w:r>
+        <w:rPr>
+          <w:rFonts w:ascii="Consolas" w:cs="Consolas" w:eastAsia="Consolas" w:hAnsi="Consolas"/>
+          <w:color w:val="7A1F3D"/>
+          <w:sz w:val="19"/>
+          <w:szCs w:val="19"/>
+        </w:rPr>
+        <w:t xml:space="preserve">nominas/</w:t>
+      </w:r>
+      <w:r>
+        <w:t xml:space="preserve">). </w:t>
       </w:r>
       <w:r>
         <w:rPr>
@@ -5356,6 +5505,135 @@
       </w:r>
       <w:r>
         <w:t xml:space="preserve">; usa el comando de arriba o el script de despliegue.</w:t>
+      </w:r>
+    </w:p>
+    <w:p>
+      <w:pPr>
+        <w:pStyle w:val="ListParagraph"/>
+        <w:numPr>
+          <w:ilvl w:val="0"/>
+          <w:numId w:val="2"/>
+        </w:numPr>
+        <w:spacing w:after="60"/>
+      </w:pPr>
+      <w:r>
+        <w:rPr>
+          <w:rFonts w:ascii="Consolas" w:cs="Consolas" w:eastAsia="Consolas" w:hAnsi="Consolas"/>
+          <w:color w:val="7A1F3D"/>
+          <w:sz w:val="19"/>
+          <w:szCs w:val="19"/>
+        </w:rPr>
+        <w:t xml:space="preserve">frontend/.npmrc</w:t>
+      </w:r>
+      <w:r>
+        <w:t xml:space="preserve"> trae </w:t>
+      </w:r>
+      <w:r>
+        <w:rPr>
+          <w:rFonts w:ascii="Consolas" w:cs="Consolas" w:eastAsia="Consolas" w:hAnsi="Consolas"/>
+          <w:color w:val="7A1F3D"/>
+          <w:sz w:val="19"/>
+          <w:szCs w:val="19"/>
+        </w:rPr>
+        <w:t xml:space="preserve">legacy-peer-deps=true</w:t>
+      </w:r>
+      <w:r>
+        <w:t xml:space="preserve">: los paquetes de revisión de código (</w:t>
+      </w:r>
+      <w:r>
+        <w:rPr>
+          <w:rFonts w:ascii="Consolas" w:cs="Consolas" w:eastAsia="Consolas" w:hAnsi="Consolas"/>
+          <w:color w:val="7A1F3D"/>
+          <w:sz w:val="19"/>
+          <w:szCs w:val="19"/>
+        </w:rPr>
+        <w:t xml:space="preserve">@angular-eslint</w:t>
+      </w:r>
+      <w:r>
+        <w:t xml:space="preserve">, de Angular 21) conviven con el CLI de Angular 22. Sin ese archivo, </w:t>
+      </w:r>
+      <w:r>
+        <w:rPr>
+          <w:rFonts w:ascii="Consolas" w:cs="Consolas" w:eastAsia="Consolas" w:hAnsi="Consolas"/>
+          <w:color w:val="7A1F3D"/>
+          <w:sz w:val="19"/>
+          <w:szCs w:val="19"/>
+        </w:rPr>
+        <w:t xml:space="preserve">npm ci</w:t>
+      </w:r>
+      <w:r>
+        <w:t xml:space="preserve"> falla con </w:t>
+      </w:r>
+      <w:r>
+        <w:rPr>
+          <w:b/>
+          <w:bCs/>
+        </w:rPr>
+        <w:t xml:space="preserve">ERESOLVE</w:t>
+      </w:r>
+      <w:r>
+        <w:t xml:space="preserve">.</w:t>
+      </w:r>
+    </w:p>
+    <w:p>
+      <w:pPr>
+        <w:pStyle w:val="ListParagraph"/>
+        <w:numPr>
+          <w:ilvl w:val="0"/>
+          <w:numId w:val="2"/>
+        </w:numPr>
+        <w:spacing w:after="60"/>
+      </w:pPr>
+      <w:r>
+        <w:t xml:space="preserve">Si </w:t>
+      </w:r>
+      <w:r>
+        <w:rPr>
+          <w:rFonts w:ascii="Consolas" w:cs="Consolas" w:eastAsia="Consolas" w:hAnsi="Consolas"/>
+          <w:color w:val="7A1F3D"/>
+          <w:sz w:val="19"/>
+          <w:szCs w:val="19"/>
+        </w:rPr>
+        <w:t xml:space="preserve">git pull</w:t>
+      </w:r>
+      <w:r>
+        <w:t xml:space="preserve"> se niega porque cambiaron </w:t>
+      </w:r>
+      <w:r>
+        <w:rPr>
+          <w:rFonts w:ascii="Consolas" w:cs="Consolas" w:eastAsia="Consolas" w:hAnsi="Consolas"/>
+          <w:color w:val="7A1F3D"/>
+          <w:sz w:val="19"/>
+          <w:szCs w:val="19"/>
+        </w:rPr>
+        <w:t xml:space="preserve">package.json</w:t>
+      </w:r>
+      <w:r>
+        <w:t xml:space="preserve"> o </w:t>
+      </w:r>
+      <w:r>
+        <w:rPr>
+          <w:rFonts w:ascii="Consolas" w:cs="Consolas" w:eastAsia="Consolas" w:hAnsi="Consolas"/>
+          <w:color w:val="7A1F3D"/>
+          <w:sz w:val="19"/>
+          <w:szCs w:val="19"/>
+        </w:rPr>
+        <w:t xml:space="preserve">package-lock.json</w:t>
+      </w:r>
+      <w:r>
+        <w:t xml:space="preserve"> en el servidor, regrésalos con </w:t>
+      </w:r>
+      <w:r>
+        <w:rPr>
+          <w:rFonts w:ascii="Consolas" w:cs="Consolas" w:eastAsia="Consolas" w:hAnsi="Consolas"/>
+          <w:color w:val="7A1F3D"/>
+          <w:sz w:val="19"/>
+          <w:szCs w:val="19"/>
+        </w:rPr>
+        <w:t xml:space="preserve">git checkout -- frontend/package.json frontend/package-lock.json</w:t>
+      </w:r>
+      <w:r>
+        <w:t xml:space="preserve"> antes de actualizar.</w:t>
       </w:r>
     </w:p>
     <w:p>
@@ -7750,6 +8028,86 @@
           </w:p>
         </w:tc>
       </w:tr>
+      <w:tr>
+        <w:tc>
+          <w:tcPr>
+            <w:tcW w:type="dxa" w:w="3800"/>
+            <w:tcBorders>
+              <w:top w:val="single" w:color="D9D9D9" w:sz="4"/>
+              <w:left w:val="single" w:color="D9D9D9" w:sz="4"/>
+              <w:bottom w:val="single" w:color="D9D9D9" w:sz="4"/>
+              <w:right w:val="single" w:color="D9D9D9" w:sz="4"/>
+            </w:tcBorders>
+            <w:tcMar>
+              <w:top w:type="dxa" w:w="60"/>
+              <w:left w:type="dxa" w:w="100"/>
+              <w:bottom w:type="dxa" w:w="60"/>
+              <w:right w:type="dxa" w:w="100"/>
+            </w:tcMar>
+          </w:tcPr>
+          <w:p>
+            <w:r>
+              <w:rPr>
+                <w:sz w:val="19"/>
+                <w:szCs w:val="19"/>
+              </w:rPr>
+              <w:t xml:space="preserve">Personal de Recursos Humanos con el rol Recursos Humanos (nómina); Control Presupuestal con el permiso para validarla</w:t>
+            </w:r>
+          </w:p>
+        </w:tc>
+        <w:tc>
+          <w:tcPr>
+            <w:tcW w:type="dxa" w:w="3460"/>
+            <w:tcBorders>
+              <w:top w:val="single" w:color="D9D9D9" w:sz="4"/>
+              <w:left w:val="single" w:color="D9D9D9" w:sz="4"/>
+              <w:bottom w:val="single" w:color="D9D9D9" w:sz="4"/>
+              <w:right w:val="single" w:color="D9D9D9" w:sz="4"/>
+            </w:tcBorders>
+            <w:tcMar>
+              <w:top w:type="dxa" w:w="60"/>
+              <w:left w:type="dxa" w:w="100"/>
+              <w:bottom w:type="dxa" w:w="60"/>
+              <w:right w:type="dxa" w:w="100"/>
+            </w:tcMar>
+          </w:tcPr>
+          <w:p>
+            <w:r>
+              <w:rPr>
+                <w:sz w:val="19"/>
+                <w:szCs w:val="19"/>
+              </w:rPr>
+              <w:t xml:space="preserve">Administración → Usuarios / Roles</w:t>
+            </w:r>
+          </w:p>
+        </w:tc>
+        <w:tc>
+          <w:tcPr>
+            <w:tcW w:type="dxa" w:w="2100"/>
+            <w:tcBorders>
+              <w:top w:val="single" w:color="D9D9D9" w:sz="4"/>
+              <w:left w:val="single" w:color="D9D9D9" w:sz="4"/>
+              <w:bottom w:val="single" w:color="D9D9D9" w:sz="4"/>
+              <w:right w:val="single" w:color="D9D9D9" w:sz="4"/>
+            </w:tcBorders>
+            <w:tcMar>
+              <w:top w:type="dxa" w:w="60"/>
+              <w:left w:type="dxa" w:w="100"/>
+              <w:bottom w:type="dxa" w:w="60"/>
+              <w:right w:type="dxa" w:w="100"/>
+            </w:tcMar>
+          </w:tcPr>
+          <w:p>
+            <w:r>
+              <w:rPr>
+                <w:sz w:val="19"/>
+                <w:szCs w:val="19"/>
+              </w:rPr>
+              <w:t xml:space="preserve">Administración</w:t>
+            </w:r>
+          </w:p>
+        </w:tc>
+      </w:tr>
     </w:tbl>
     <w:p>
       <w:pPr>
@@ -7854,6 +8212,137 @@
       </w:pPr>
       <w:r>
         <w:t xml:space="preserve">Si el emisor aparece en la lista de EFOS del SAT, la factura se acepta con advertencia.</w:t>
+      </w:r>
+    </w:p>
+    <w:p>
+      <w:pPr>
+        <w:pStyle w:val="Heading2"/>
+      </w:pPr>
+      <w:r>
+        <w:t xml:space="preserve">6.3 Nómina y capítulo 1000</w:t>
+      </w:r>
+    </w:p>
+    <w:p>
+      <w:pPr>
+        <w:pStyle w:val="ListParagraph"/>
+        <w:numPr>
+          <w:ilvl w:val="0"/>
+          <w:numId w:val="2"/>
+        </w:numPr>
+        <w:spacing w:after="60"/>
+      </w:pPr>
+      <w:r>
+        <w:t xml:space="preserve">El cálculo y el timbrado de la nómina siguen en Nomipac. Recursos Humanos acomoda lo que genera Nomipac en la plantilla de SIEG (</w:t>
+      </w:r>
+      <w:r>
+        <w:rPr>
+          <w:b/>
+          <w:bCs/>
+        </w:rPr>
+        <w:t xml:space="preserve">Unidad</w:t>
+      </w:r>
+      <w:r>
+        <w:t xml:space="preserve">, </w:t>
+      </w:r>
+      <w:r>
+        <w:rPr>
+          <w:b/>
+          <w:bCs/>
+        </w:rPr>
+        <w:t xml:space="preserve">Fuente</w:t>
+      </w:r>
+      <w:r>
+        <w:t xml:space="preserve">, </w:t>
+      </w:r>
+      <w:r>
+        <w:rPr>
+          <w:b/>
+          <w:bCs/>
+        </w:rPr>
+        <w:t xml:space="preserve">Proyecto</w:t>
+      </w:r>
+      <w:r>
+        <w:t xml:space="preserve">, </w:t>
+      </w:r>
+      <w:r>
+        <w:rPr>
+          <w:b/>
+          <w:bCs/>
+        </w:rPr>
+        <w:t xml:space="preserve">Partida</w:t>
+      </w:r>
+      <w:r>
+        <w:t xml:space="preserve">, </w:t>
+      </w:r>
+      <w:r>
+        <w:rPr>
+          <w:b/>
+          <w:bCs/>
+        </w:rPr>
+        <w:t xml:space="preserve">Concepto</w:t>
+      </w:r>
+      <w:r>
+        <w:t xml:space="preserve">, </w:t>
+      </w:r>
+      <w:r>
+        <w:rPr>
+          <w:b/>
+          <w:bCs/>
+        </w:rPr>
+        <w:t xml:space="preserve">Importe</w:t>
+      </w:r>
+      <w:r>
+        <w:t xml:space="preserve">; se descarga desde la pantalla de Nómina) y la importa. La unidad es la clave presupuestal (CLAVE del presupuesto); los ceros a la izquierda que pierda Excel se corrigen solos.</w:t>
+      </w:r>
+    </w:p>
+    <w:p>
+      <w:pPr>
+        <w:pStyle w:val="ListParagraph"/>
+        <w:numPr>
+          <w:ilvl w:val="0"/>
+          <w:numId w:val="2"/>
+        </w:numPr>
+        <w:spacing w:after="60"/>
+      </w:pPr>
+      <w:r>
+        <w:t xml:space="preserve">Al validar Control Presupuestal se generan, por cada unidad, la requisición, un registro sin factura con folio </w:t>
+      </w:r>
+      <w:r>
+        <w:rPr>
+          <w:rFonts w:ascii="Consolas" w:cs="Consolas" w:eastAsia="Consolas" w:hAnsi="Consolas"/>
+          <w:color w:val="7A1F3D"/>
+          <w:sz w:val="19"/>
+          <w:szCs w:val="19"/>
+        </w:rPr>
+        <w:t xml:space="preserve">PN-AÑO-0001</w:t>
+      </w:r>
+      <w:r>
+        <w:t xml:space="preserve"> y la CLC, que entra al trámite en Control Presupuestal. No necesita configuración adicional.</w:t>
+      </w:r>
+    </w:p>
+    <w:p>
+      <w:pPr>
+        <w:pStyle w:val="ListParagraph"/>
+        <w:numPr>
+          <w:ilvl w:val="0"/>
+          <w:numId w:val="2"/>
+        </w:numPr>
+        <w:spacing w:after="60"/>
+      </w:pPr>
+      <w:r>
+        <w:t xml:space="preserve">Las partidas del capítulo 1000 (las que empiezan con 1) solo las usan quienes tienen el permiso </w:t>
+      </w:r>
+      <w:r>
+        <w:rPr>
+          <w:rFonts w:ascii="Consolas" w:cs="Consolas" w:eastAsia="Consolas" w:hAnsi="Consolas"/>
+          <w:color w:val="7A1F3D"/>
+          <w:sz w:val="19"/>
+          <w:szCs w:val="19"/>
+        </w:rPr>
+        <w:t xml:space="preserve">presupuesto-capitulo-1000</w:t>
+      </w:r>
+      <w:r>
+        <w:t xml:space="preserve"> (Admin, Recursos Humanos y Control Presupuestal). Las áreas no las ven en requisiciones, trámites, contratos ni modificaciones presupuestales.</w:t>
       </w:r>
     </w:p>
     <w:p>
@@ -10969,6 +11458,19 @@
         <w:spacing w:after="60"/>
       </w:pPr>
       <w:r>
+        <w:t xml:space="preserve">Prueba de nómina: Recursos Humanos importa una quincena con la plantilla, Control Presupuestal la valida y se revisan las CLC por unidad.</w:t>
+      </w:r>
+    </w:p>
+    <w:p>
+      <w:pPr>
+        <w:pStyle w:val="ListParagraph"/>
+        <w:numPr>
+          <w:ilvl w:val="0"/>
+          <w:numId w:val="5"/>
+        </w:numPr>
+        <w:spacing w:after="60"/>
+      </w:pPr>
+      <w:r>
         <w:t xml:space="preserve">Presupuesto, calendario, cuentas bancarias, proveedores y usuarios cargados (6.1).</w:t>
       </w:r>
     </w:p>
@@ -11151,7 +11653,7 @@
                 <w:sz w:val="19"/>
                 <w:szCs w:val="19"/>
               </w:rPr>
-              <w:t xml:space="preserve">Controladores de la API (requisiciones, órdenes, CLC, Tesorería, combustible, contratos, padrón, etc.).</w:t>
+              <w:t xml:space="preserve">Controladores de la API (requisiciones, órdenes, CLC, Tesorería, combustible, contratos, padrón, nómina, etc.).</w:t>
             </w:r>
           </w:p>
         </w:tc>
@@ -11207,7 +11709,39 @@
                 <w:sz w:val="19"/>
                 <w:szCs w:val="19"/>
               </w:rPr>
-              <w:t xml:space="preserve">Reglas de negocio: CFDI y SAT, trámite de CLC, presupuesto, pagos, Excel.</w:t>
+              <w:t xml:space="preserve">Reglas de negocio: CFDI y SAT, trámite de CLC, presupuesto, pagos, Excel, nómina (</w:t>
+            </w:r>
+            <w:r>
+              <w:rPr>
+                <w:rFonts w:ascii="Consolas" w:cs="Consolas" w:eastAsia="Consolas" w:hAnsi="Consolas"/>
+                <w:color w:val="7A1F3D"/>
+                <w:sz w:val="19"/>
+                <w:szCs w:val="19"/>
+              </w:rPr>
+              <w:t xml:space="preserve">GeneradorNomina</w:t>
+            </w:r>
+            <w:r>
+              <w:rPr>
+                <w:sz w:val="19"/>
+                <w:szCs w:val="19"/>
+              </w:rPr>
+              <w:t xml:space="preserve">, </w:t>
+            </w:r>
+            <w:r>
+              <w:rPr>
+                <w:rFonts w:ascii="Consolas" w:cs="Consolas" w:eastAsia="Consolas" w:hAnsi="Consolas"/>
+                <w:color w:val="7A1F3D"/>
+                <w:sz w:val="19"/>
+                <w:szCs w:val="19"/>
+              </w:rPr>
+              <w:t xml:space="preserve">ExcelNomina</w:t>
+            </w:r>
+            <w:r>
+              <w:rPr>
+                <w:sz w:val="19"/>
+                <w:szCs w:val="19"/>
+              </w:rPr>
+              <w:t xml:space="preserve">).</w:t>
             </w:r>
           </w:p>
         </w:tc>
@@ -11713,6 +12247,62 @@
                 <w:szCs w:val="19"/>
               </w:rPr>
               <w:t xml:space="preserve">Script de despliegue (capítulo 5).</w:t>
+            </w:r>
+          </w:p>
+        </w:tc>
+      </w:tr>
+      <w:tr>
+        <w:tc>
+          <w:tcPr>
+            <w:tcW w:type="dxa" w:w="4200"/>
+            <w:tcBorders>
+              <w:top w:val="single" w:color="D9D9D9" w:sz="4"/>
+              <w:left w:val="single" w:color="D9D9D9" w:sz="4"/>
+              <w:bottom w:val="single" w:color="D9D9D9" w:sz="4"/>
+              <w:right w:val="single" w:color="D9D9D9" w:sz="4"/>
+            </w:tcBorders>
+            <w:tcMar>
+              <w:top w:type="dxa" w:w="60"/>
+              <w:left w:type="dxa" w:w="100"/>
+              <w:bottom w:type="dxa" w:w="60"/>
+              <w:right w:type="dxa" w:w="100"/>
+            </w:tcMar>
+          </w:tcPr>
+          <w:p>
+            <w:r>
+              <w:rPr>
+                <w:rFonts w:ascii="Consolas" w:cs="Consolas" w:eastAsia="Consolas" w:hAnsi="Consolas"/>
+                <w:color w:val="7A1F3D"/>
+                <w:sz w:val="19"/>
+                <w:szCs w:val="19"/>
+              </w:rPr>
+              <w:t xml:space="preserve">docs/manuales/generador</w:t>
+            </w:r>
+          </w:p>
+        </w:tc>
+        <w:tc>
+          <w:tcPr>
+            <w:tcW w:type="dxa" w:w="5160"/>
+            <w:tcBorders>
+              <w:top w:val="single" w:color="D9D9D9" w:sz="4"/>
+              <w:left w:val="single" w:color="D9D9D9" w:sz="4"/>
+              <w:bottom w:val="single" w:color="D9D9D9" w:sz="4"/>
+              <w:right w:val="single" w:color="D9D9D9" w:sz="4"/>
+            </w:tcBorders>
+            <w:tcMar>
+              <w:top w:type="dxa" w:w="60"/>
+              <w:left w:type="dxa" w:w="100"/>
+              <w:bottom w:type="dxa" w:w="60"/>
+              <w:right w:type="dxa" w:w="100"/>
+            </w:tcMar>
+          </w:tcPr>
+          <w:p>
+            <w:r>
+              <w:rPr>
+                <w:sz w:val="19"/>
+                <w:szCs w:val="19"/>
+              </w:rPr>
+              <w:t xml:space="preserve">Generador de estos manuales (base de demostración, capturas y Word).</w:t>
             </w:r>
           </w:p>
         </w:tc>

</xml_diff>